<commit_message>
chore: 2026-07-17 18:55 auto commit
</commit_message>
<xml_diff>
--- a/docs/软件设计.docx
+++ b/docs/软件设计.docx
@@ -1602,7 +1602,20 @@
           <w:rStyle w:val="VerbatimChar"/>
           <w:rFonts w:hint="eastAsia"/>
         </w:rPr>
-        <w:t xml:space="preserve">传感器经前置放大后的信号）^[3,4,5]^</w:t>
+        <w:t xml:space="preserve">传感器经前置放大后的信号）→</w:t>
+      </w:r>
+      <w:r>
+        <w:rPr>
+          <w:rStyle w:val="VerbatimChar"/>
+        </w:rPr>
+        <w:t xml:space="preserve"> </w:t>
+      </w:r>
+      <w:r>
+        <w:rPr>
+          <w:rStyle w:val="VerbatimChar"/>
+          <w:rFonts w:hint="eastAsia"/>
+        </w:rPr>
+        <w:t xml:space="preserve">数字陷波(50/60Hz)</w:t>
       </w:r>
       <w:r>
         <w:rPr>
@@ -1615,7 +1628,23 @@
           <w:rStyle w:val="VerbatimChar"/>
           <w:rFonts w:hint="eastAsia"/>
         </w:rPr>
-        <w:t xml:space="preserve">数字陷波(50/60Hz)</w:t>
+        <w:t xml:space="preserve">环形缓冲区(512点)</w:t>
+      </w:r>
+      <w:r>
+        <w:br/>
+      </w:r>
+      <w:r>
+        <w:rPr>
+          <w:rStyle w:val="VerbatimChar"/>
+        </w:rPr>
+        <w:t xml:space="preserve">    → </w:t>
+      </w:r>
+      <w:r>
+        <w:rPr>
+          <w:rStyle w:val="VerbatimChar"/>
+          <w:rFonts w:hint="eastAsia"/>
+        </w:rPr>
+        <w:t xml:space="preserve">256点快照</w:t>
       </w:r>
       <w:r>
         <w:rPr>
@@ -1628,7 +1657,33 @@
           <w:rStyle w:val="VerbatimChar"/>
           <w:rFonts w:hint="eastAsia"/>
         </w:rPr>
-        <w:t xml:space="preserve">环形缓冲区(512点)</w:t>
+        <w:t xml:space="preserve">RMS计算(AC耦合)</w:t>
+      </w:r>
+      <w:r>
+        <w:rPr>
+          <w:rStyle w:val="VerbatimChar"/>
+        </w:rPr>
+        <w:t xml:space="preserve"> → </w:t>
+      </w:r>
+      <w:r>
+        <w:rPr>
+          <w:rStyle w:val="VerbatimChar"/>
+          <w:rFonts w:hint="eastAsia"/>
+        </w:rPr>
+        <w:t xml:space="preserve">FFT+功率谱</w:t>
+      </w:r>
+      <w:r>
+        <w:rPr>
+          <w:rStyle w:val="VerbatimChar"/>
+        </w:rPr>
+        <w:t xml:space="preserve"> → </w:t>
+      </w:r>
+      <w:r>
+        <w:rPr>
+          <w:rStyle w:val="VerbatimChar"/>
+          <w:rFonts w:hint="eastAsia"/>
+        </w:rPr>
+        <w:t xml:space="preserve">MDF计算(20~250Hz)</w:t>
       </w:r>
       <w:r>
         <w:br/>
@@ -1644,7 +1699,7 @@
           <w:rStyle w:val="VerbatimChar"/>
           <w:rFonts w:hint="eastAsia"/>
         </w:rPr>
-        <w:t xml:space="preserve">256点快照</w:t>
+        <w:t xml:space="preserve">激活度计算</w:t>
       </w:r>
       <w:r>
         <w:rPr>
@@ -1657,7 +1712,7 @@
           <w:rStyle w:val="VerbatimChar"/>
           <w:rFonts w:hint="eastAsia"/>
         </w:rPr>
-        <w:t xml:space="preserve">RMS计算(AC耦合)</w:t>
+        <w:t xml:space="preserve">疲劳度计算(双锚点+EMA)</w:t>
       </w:r>
       <w:r>
         <w:rPr>
@@ -1670,67 +1725,32 @@
           <w:rStyle w:val="VerbatimChar"/>
           <w:rFonts w:hint="eastAsia"/>
         </w:rPr>
-        <w:t xml:space="preserve">FFT+功率谱</w:t>
-      </w:r>
-      <w:r>
-        <w:rPr>
-          <w:rStyle w:val="VerbatimChar"/>
-        </w:rPr>
-        <w:t xml:space="preserve"> → </w:t>
-      </w:r>
-      <w:r>
-        <w:rPr>
-          <w:rStyle w:val="VerbatimChar"/>
-          <w:rFonts w:hint="eastAsia"/>
-        </w:rPr>
-        <w:t xml:space="preserve">MDF计算(20~250Hz)</w:t>
-      </w:r>
-      <w:r>
-        <w:br/>
-      </w:r>
-      <w:r>
-        <w:rPr>
-          <w:rStyle w:val="VerbatimChar"/>
-        </w:rPr>
-        <w:t xml:space="preserve">    → </w:t>
-      </w:r>
-      <w:r>
-        <w:rPr>
-          <w:rStyle w:val="VerbatimChar"/>
-          <w:rFonts w:hint="eastAsia"/>
-        </w:rPr>
-        <w:t xml:space="preserve">激活度计算</w:t>
-      </w:r>
-      <w:r>
-        <w:rPr>
-          <w:rStyle w:val="VerbatimChar"/>
-        </w:rPr>
-        <w:t xml:space="preserve"> → </w:t>
-      </w:r>
-      <w:r>
-        <w:rPr>
-          <w:rStyle w:val="VerbatimChar"/>
-          <w:rFonts w:hint="eastAsia"/>
-        </w:rPr>
-        <w:t xml:space="preserve">疲劳度计算(双锚点+EMA)</w:t>
-      </w:r>
-      <w:r>
-        <w:rPr>
-          <w:rStyle w:val="VerbatimChar"/>
-        </w:rPr>
-        <w:t xml:space="preserve"> → </w:t>
-      </w:r>
-      <w:r>
-        <w:rPr>
-          <w:rStyle w:val="VerbatimChar"/>
-          <w:rFonts w:hint="eastAsia"/>
-        </w:rPr>
         <w:t xml:space="preserve">信号质量评估</w:t>
       </w:r>
     </w:p>
     <w:p>
       <w:pPr>
         <w:pStyle w:val="FirstParagraph"/>
+      </w:pPr>
+      <w:r>
+        <w:rPr>
+          <w:rFonts w:hint="eastAsia"/>
+        </w:rPr>
+        <w:t xml:space="preserve">信号处理链路各模块设计参考相关文献</w:t>
+      </w:r>
+      <w:r>
+        <w:rPr>
+          <w:vertAlign w:val="superscript"/>
+        </w:rPr>
+        <w:t xml:space="preserve">[3,4,5]</w:t>
+      </w:r>
+      <w:r>
+        <w:t xml:space="preserve">。</w:t>
+      </w:r>
+    </w:p>
+    <w:p>
+      <w:pPr>
+        <w:pStyle w:val="BodyText"/>
       </w:pPr>
       <w:r>
         <w:rPr>

</xml_diff>